<commit_message>
barlow/finesst: resolve all 11 Glennie v11 comments + lowercase lidar per community convention
Why-it-matters and forecasting sentences added; LTER/ERA5/AMPS/ICP/LOD95/NMAD
spelled out at first use; mm/yr conceded to cm/yr; dissertation cited in
Project Needs; page budget held at 6 pp body via content-preserving trims.
Promoted to finesst_final + submission copies.

Co-Authored-By: Claude Fable 5 <noreply@anthropic.com>
</commit_message>
<xml_diff>
--- a/barlow/finesst_final/OSDMP.docx
+++ b/barlow/finesst_final/OSDMP.docx
@@ -125,7 +125,7 @@
               <w:rPr>
                 <w:sz w:val="18"/>
               </w:rPr>
-              <w:t>LiDAR</w:t>
+              <w:t>lidar</w:t>
             </w:r>
             <w:proofErr w:type="spellEnd"/>
             <w:r>
@@ -200,7 +200,7 @@
               <w:rPr>
                 <w:sz w:val="18"/>
               </w:rPr>
-              <w:t>LiDAR</w:t>
+              <w:t>lidar</w:t>
             </w:r>
             <w:proofErr w:type="spellEnd"/>
             <w:r>

</xml_diff>